<commit_message>
Update problem proposal document
.
</commit_message>
<xml_diff>
--- a/1.6 Propuesta del problema.docx
+++ b/1.6 Propuesta del problema.docx
@@ -1880,17 +1880,106 @@
           </wp:inline>
         </w:drawing>
       </w:r>
+    </w:p>
+    <w:p>
+      <w:pPr>
+        <w:spacing w:before="100" w:beforeAutospacing="1" w:after="100" w:afterAutospacing="1" w:line="240" w:lineRule="auto"/>
+        <w:rPr>
+          <w:rFonts w:eastAsia="Times New Roman" w:cstheme="minorHAnsi"/>
+          <w:lang w:val="es-CO"/>
+        </w:rPr>
+      </w:pPr>
+    </w:p>
+    <w:p>
+      <w:pPr>
+        <w:spacing w:before="100" w:beforeAutospacing="1" w:after="100" w:afterAutospacing="1" w:line="240" w:lineRule="auto"/>
+        <w:jc w:val="center"/>
+        <w:rPr>
+          <w:rFonts w:eastAsia="Times New Roman" w:cstheme="minorHAnsi"/>
+          <w:lang w:val="es-CO"/>
+        </w:rPr>
+      </w:pPr>
+      <w:r>
+        <w:rPr>
+          <w:rFonts w:eastAsia="Times New Roman" w:cstheme="minorHAnsi"/>
+          <w:lang w:val="es-CO"/>
+        </w:rPr>
+        <w:t>Solución escogida</w:t>
+      </w:r>
+    </w:p>
+    <w:p>
+      <w:pPr>
+        <w:spacing w:before="100" w:beforeAutospacing="1" w:after="100" w:afterAutospacing="1" w:line="240" w:lineRule="auto"/>
+        <w:jc w:val="center"/>
+        <w:rPr>
+          <w:rFonts w:eastAsia="Times New Roman" w:cstheme="minorHAnsi"/>
+          <w:lang w:val="es-CO"/>
+        </w:rPr>
+      </w:pPr>
+    </w:p>
+    <w:p>
+      <w:pPr>
+        <w:spacing w:before="100" w:beforeAutospacing="1" w:after="100" w:afterAutospacing="1" w:line="240" w:lineRule="auto"/>
+        <w:rPr>
+          <w:rFonts w:eastAsia="Times New Roman" w:cstheme="minorHAnsi"/>
+          <w:lang w:val="es-CO"/>
+        </w:rPr>
+      </w:pPr>
+      <w:r>
+        <w:rPr>
+          <w:rFonts w:eastAsia="Times New Roman" w:cstheme="minorHAnsi"/>
+          <w:lang w:val="es-CO"/>
+        </w:rPr>
+        <w:t xml:space="preserve">Se escoge la propuesta 3, la propuesta de </w:t>
+      </w:r>
+      <w:proofErr w:type="spellStart"/>
+      <w:r>
+        <w:rPr>
+          <w:rFonts w:eastAsia="Times New Roman" w:cstheme="minorHAnsi"/>
+          <w:lang w:val="es-CO"/>
+        </w:rPr>
+        <w:t>isabella</w:t>
+      </w:r>
+      <w:proofErr w:type="spellEnd"/>
+      <w:r>
+        <w:rPr>
+          <w:rFonts w:eastAsia="Times New Roman" w:cstheme="minorHAnsi"/>
+          <w:lang w:val="es-CO"/>
+        </w:rPr>
+        <w:t>; ya que tiene en cuenta las necesidades reales del cliente y los requisitos del proyecto final.</w:t>
+      </w:r>
+    </w:p>
+    <w:p>
+      <w:pPr>
+        <w:spacing w:before="100" w:beforeAutospacing="1" w:after="100" w:afterAutospacing="1" w:line="240" w:lineRule="auto"/>
+        <w:rPr>
+          <w:rFonts w:eastAsia="Times New Roman" w:cstheme="minorHAnsi"/>
+          <w:lang w:val="es-CO"/>
+        </w:rPr>
+      </w:pPr>
+      <w:r>
+        <w:rPr>
+          <w:rFonts w:eastAsia="Times New Roman" w:cstheme="minorHAnsi"/>
+          <w:lang w:val="es-CO"/>
+        </w:rPr>
+        <w:t>Se concentra en guardar y crear datos para el consultorio</w:t>
+      </w:r>
+      <w:r>
+        <w:rPr>
+          <w:rFonts w:eastAsia="Times New Roman" w:cstheme="minorHAnsi"/>
+          <w:lang w:val="es-CO"/>
+        </w:rPr>
+        <w:t>, no crea necesidades inexistentes y se centra en pocas tareas de tal manera que a pesar de que sea un proyecto con pocas funcionalidades grandes es un proyecto completo para las necesidades del cliente.</w:t>
+      </w:r>
       <w:bookmarkStart w:id="0" w:name="_GoBack"/>
       <w:bookmarkEnd w:id="0"/>
-    </w:p>
-    <w:p>
-      <w:pPr>
-        <w:spacing w:before="100" w:beforeAutospacing="1" w:after="100" w:afterAutospacing="1" w:line="240" w:lineRule="auto"/>
-        <w:rPr>
-          <w:rFonts w:eastAsia="Times New Roman" w:cstheme="minorHAnsi"/>
-          <w:lang w:val="es-CO"/>
-        </w:rPr>
-      </w:pPr>
+      <w:r>
+        <w:rPr>
+          <w:rFonts w:eastAsia="Times New Roman" w:cstheme="minorHAnsi"/>
+          <w:lang w:val="es-CO"/>
+        </w:rPr>
+        <w:t xml:space="preserve"> </w:t>
+      </w:r>
     </w:p>
     <w:sectPr>
       <w:pgSz w:w="12240" w:h="15840"/>
@@ -5272,7 +5361,7 @@
 </file>
 
 <file path=customXml/itemProps1.xml><?xml version="1.0" encoding="utf-8"?>
-<ds:datastoreItem xmlns:ds="http://schemas.openxmlformats.org/officeDocument/2006/customXml" ds:itemID="{F9609326-06F2-472D-8C62-0F03BC2CEF5F}">
+<ds:datastoreItem xmlns:ds="http://schemas.openxmlformats.org/officeDocument/2006/customXml" ds:itemID="{C4CE6FB8-7FAD-4E92-BAF5-FCF7D679BEC6}">
   <ds:schemaRefs>
     <ds:schemaRef ds:uri="http://schemas.openxmlformats.org/officeDocument/2006/bibliography"/>
   </ds:schemaRefs>

</xml_diff>